<commit_message>
Record the owner's decisions (D1-D19) as ADRs and apply them to the plan
docs/decisions/ holds one ADR per decision from the Step 0.1 review on
16 October 2026, plus an index. PLAN.md v0.5 shows §15 as settled and
updates the affected sections: friends-first rollout (D1), the Unity spike
with doubled pass marks and a failure report (D3), invite-only purchase
with five invites per plan (D4), India (Gujarat) with friendly Gujarati
and a new Step 2.12 (D10), Custom and Free learning paces (D18), licence
protection and a free safety core (D15), clinical review before public
release (D16). D13, the name, stays open with a shortlist in ADR 0013.

BUILD-GUIDE: Steps 0.6, 2.4, 2.5 and 5.4 updated, Step 2.12 added (51
steps). Both Word documents regenerated.

Co-Authored-By: Claude Fable 5.1 <noreply@anthropic.com>
Claude-Session: https://claude.ai/code/session_01Q5HZ8uMa5Vnj1Ze8ko5rDx
</commit_message>
<xml_diff>
--- a/docs/1-addic-decisions-needed.docx
+++ b/docs/1-addic-decisions-needed.docx
@@ -124,7 +124,7 @@
           <w:sz w:val="18"/>
           <w:szCs w:val="18"/>
         </w:rPr>
-        <w:t xml:space="preserve">Companion to the 1-addic Execution Plan (docs/1-addic-execution-plan.docx). Decisions follow PLAN.md §15, draft v0.4.</w:t>
+        <w:t xml:space="preserve">Companion to the 1-addic Execution Plan (docs/1-addic-execution-plan.docx). Answered by the owner on 16 October 2026; see docs/decisions/.</w:t>
       </w:r>
     </w:p>
     <w:p>
@@ -137,7 +137,7 @@
           <w:sz w:val="18"/>
           <w:szCs w:val="18"/>
         </w:rPr>
-        <w:t xml:space="preserve">Generated 15 October 2026. Rebuild with: node scripts/build_decisions_doc.js</w:t>
+        <w:t xml:space="preserve">Generated 16 October 2026. Rebuild with: node scripts/build_decisions_doc.js</w:t>
       </w:r>
     </w:p>
     <w:p>
@@ -873,6 +873,69 @@
             </w:r>
             <w:r>
               <w:t xml:space="preserve">This is the list of everything the project needs from you, written as questions. Each one explains why it matters, shows the options, and gives a recommendation. Where “accept the recommendation” is a good answer, say so and move on.</w:t>
+            </w:r>
+          </w:p>
+        </w:tc>
+      </w:tr>
+    </w:tbl>
+    <w:p>
+      <w:pPr>
+        <w:spacing w:after="100" w:before="0"/>
+      </w:pPr>
+    </w:p>
+    <w:tbl>
+      <w:tblPr>
+        <w:tblW w:type="dxa" w:w="9406"/>
+        <w:tblBorders>
+          <w:top w:val="none" w:color="FFFFFF" w:sz="0"/>
+          <w:left w:val="none" w:color="FFFFFF" w:sz="0"/>
+          <w:bottom w:val="none" w:color="FFFFFF" w:sz="0"/>
+          <w:right w:val="none" w:color="FFFFFF" w:sz="0"/>
+          <w:insideH w:val="none" w:color="FFFFFF" w:sz="0"/>
+          <w:insideV w:val="none" w:color="FFFFFF" w:sz="0"/>
+        </w:tblBorders>
+        <w:tblLayout w:type="fixed"/>
+      </w:tblPr>
+      <w:tblGrid>
+        <w:gridCol w:w="9406"/>
+      </w:tblGrid>
+      <w:tr>
+        <w:trPr>
+          <w:cantSplit/>
+        </w:trPr>
+        <w:tc>
+          <w:tcPr>
+            <w:tcW w:type="dxa" w:w="9406"/>
+            <w:tcBorders>
+              <w:top w:val="none" w:color="FFFFFF" w:sz="0"/>
+              <w:left w:val="single" w:color="8A9095" w:sz="28"/>
+              <w:bottom w:val="none" w:color="FFFFFF" w:sz="0"/>
+              <w:right w:val="none" w:color="FFFFFF" w:sz="0"/>
+            </w:tcBorders>
+            <w:shd w:fill="F2F3F4" w:color="auto" w:val="clear"/>
+            <w:tcMar>
+              <w:top w:type="dxa" w:w="90"/>
+              <w:left w:type="dxa" w:w="160"/>
+              <w:bottom w:type="dxa" w:w="90"/>
+              <w:right w:type="dxa" w:w="160"/>
+            </w:tcMar>
+          </w:tcPr>
+          <w:p>
+            <w:pPr>
+              <w:pStyle w:val="CalloutText"/>
+              <w:keepNext w:val="false"/>
+              <w:keepLines/>
+            </w:pPr>
+            <w:r>
+              <w:rPr>
+                <w:b/>
+                <w:bCs/>
+                <w:color w:val="0B4F4F"/>
+              </w:rPr>
+              <w:t xml:space="preserve">Status: </w:t>
+            </w:r>
+            <w:r>
+              <w:t xml:space="preserve">Answered by the owner on 16 October 2026. The answers are recorded in docs/decisions/ (records 0001 to 0019) and in PLAN.md §15, and the plan was updated to match. One question is still open: D13, the app’s name (a shortlist is in record 0013). This document stays as the record of the questions, the options and the recommendations as they stood.</w:t>
             </w:r>
           </w:p>
         </w:tc>

</xml_diff>